<commit_message>
chore(api): regenerate the due-diligence report template from its script
The codemod rewrote the stored asset in place, and the run-preserving patcher
splits a run where it replaces a sub-range, so the loop counter and the text
after it landed in separate runs. The asset has a generator; running it emits
the same markers with the runs the document is meant to have.
</commit_message>
<xml_diff>
--- a/apps/api/src/handlers/reports/assets/dd-report.docx
+++ b/apps/api/src/handlers/reports/assets/dd-report.docx
@@ -44,9 +44,6 @@
     </w:p>
     <w:p>
       <w:r>
-        <w:t xml:space="preserve"/>
-      </w:r>
-      <w:r>
         <w:t xml:space="preserve">{% if aiNarrative %}</w:t>
       </w:r>
     </w:p>
@@ -60,16 +57,10 @@
     </w:p>
     <w:p>
       <w:r>
-        <w:t xml:space="preserve"/>
-      </w:r>
-      <w:r>
         <w:t xml:space="preserve">{% endif %}</w:t>
       </w:r>
     </w:p>
     <w:p>
-      <w:r>
-        <w:t xml:space="preserve"/>
-      </w:r>
       <w:r>
         <w:t xml:space="preserve">{% if hasVerdicts %}</w:t>
       </w:r>
@@ -359,9 +350,6 @@
     </w:tbl>
     <w:p>
       <w:r>
-        <w:t xml:space="preserve"/>
-      </w:r>
-      <w:r>
         <w:t xml:space="preserve">{% else %}</w:t>
       </w:r>
     </w:p>
@@ -435,9 +423,6 @@
     </w:tbl>
     <w:p>
       <w:r>
-        <w:t xml:space="preserve"/>
-      </w:r>
-      <w:r>
         <w:t xml:space="preserve">{% endif %}</w:t>
       </w:r>
     </w:p>
@@ -451,9 +436,6 @@
     </w:p>
     <w:p>
       <w:r>
-        <w:t xml:space="preserve"/>
-      </w:r>
-      <w:r>
         <w:t xml:space="preserve">{% for contract in contracts %}</w:t>
       </w:r>
     </w:p>
@@ -462,22 +444,10 @@
         <w:pStyle w:val="Heading2"/>
       </w:pPr>
       <w:r>
-        <w:t xml:space="preserve"/>
-      </w:r>
-      <w:r>
-        <w:t xml:space="preserve">{{ loop.index }}</w:t>
-      </w:r>
-      <w:r>
-        <w:t xml:space="preserve">. </w:t>
-      </w:r>
-      <w:r>
-        <w:t xml:space="preserve">{{ contract.name }}</w:t>
-      </w:r>
-    </w:p>
-    <w:p>
-      <w:r>
-        <w:t xml:space="preserve"/>
-      </w:r>
+        <w:t xml:space="preserve">{{ loop.index }}. {{ contract.name }}</w:t>
+      </w:r>
+    </w:p>
+    <w:p>
       <w:r>
         <w:t xml:space="preserve">{% if contract.hasDocumentType %}</w:t>
       </w:r>
@@ -487,25 +457,16 @@
         <w:pStyle w:val="Caption"/>
       </w:pPr>
       <w:r>
-        <w:t xml:space="preserve">Document type: </w:t>
-      </w:r>
-      <w:r>
-        <w:t xml:space="preserve">{{ contract.documentType }}</w:t>
-      </w:r>
-    </w:p>
-    <w:p>
-      <w:r>
-        <w:t xml:space="preserve"/>
-      </w:r>
+        <w:t xml:space="preserve">Document type: {{ contract.documentType }}</w:t>
+      </w:r>
+    </w:p>
+    <w:p>
       <w:r>
         <w:t xml:space="preserve">{% endif %}</w:t>
       </w:r>
     </w:p>
     <w:p>
       <w:r>
-        <w:t xml:space="preserve"/>
-      </w:r>
-      <w:r>
         <w:t xml:space="preserve">{% if contract.hasRiskLevel %}</w:t>
       </w:r>
     </w:p>
@@ -514,24 +475,15 @@
         <w:pStyle w:val="Caption"/>
       </w:pPr>
       <w:r>
-        <w:t xml:space="preserve">Risk level: </w:t>
-      </w:r>
-      <w:r>
-        <w:t xml:space="preserve">{{ contract.riskLevel }}</w:t>
-      </w:r>
-    </w:p>
-    <w:p>
-      <w:r>
-        <w:t xml:space="preserve"/>
-      </w:r>
+        <w:t xml:space="preserve">Risk level: {{ contract.riskLevel }}</w:t>
+      </w:r>
+    </w:p>
+    <w:p>
       <w:r>
         <w:t xml:space="preserve">{% endif %}</w:t>
       </w:r>
     </w:p>
     <w:p>
-      <w:r>
-        <w:t xml:space="preserve"/>
-      </w:r>
       <w:r>
         <w:t xml:space="preserve">{% if hasVerdicts %}</w:t>
       </w:r>
@@ -642,9 +594,6 @@
           </w:tcPr>
           <w:p>
             <w:r>
-              <w:t xml:space="preserve"/>
-            </w:r>
-            <w:r>
               <w:t xml:space="preserve">{% for field in contract.fields %}</w:t>
             </w:r>
           </w:p>
@@ -658,14 +607,6 @@
                 <w:sz w:val="20"/>
                 <w:szCs w:val="20"/>
               </w:rPr>
-              <w:t xml:space="preserve"/>
-            </w:r>
-            <w:r>
-              <w:rPr>
-                <w:b/>
-                <w:sz w:val="20"/>
-                <w:szCs w:val="20"/>
-              </w:rPr>
               <w:t xml:space="preserve">{{ field.label }}</w:t>
             </w:r>
           </w:p>
@@ -684,13 +625,6 @@
                 <w:sz w:val="20"/>
                 <w:szCs w:val="20"/>
               </w:rPr>
-              <w:t xml:space="preserve"/>
-            </w:r>
-            <w:r>
-              <w:rPr>
-                <w:sz w:val="20"/>
-                <w:szCs w:val="20"/>
-              </w:rPr>
               <w:t xml:space="preserve">{{ field.value }}</w:t>
             </w:r>
           </w:p>
@@ -709,20 +643,10 @@
                 <w:sz w:val="20"/>
                 <w:szCs w:val="20"/>
               </w:rPr>
-              <w:t xml:space="preserve"/>
-            </w:r>
-            <w:r>
-              <w:rPr>
-                <w:sz w:val="20"/>
-                <w:szCs w:val="20"/>
-              </w:rPr>
               <w:t xml:space="preserve">{{ field.verdict }}</w:t>
             </w:r>
           </w:p>
           <w:p>
-            <w:r>
-              <w:t xml:space="preserve"/>
-            </w:r>
             <w:r>
               <w:t xml:space="preserve">{% endfor %}</w:t>
             </w:r>
@@ -731,9 +655,6 @@
       </w:tr>
     </w:tbl>
     <w:p>
-      <w:r>
-        <w:t xml:space="preserve"/>
-      </w:r>
       <w:r>
         <w:t xml:space="preserve">{% else %}</w:t>
       </w:r>
@@ -822,9 +743,6 @@
           </w:tcPr>
           <w:p>
             <w:r>
-              <w:t xml:space="preserve"/>
-            </w:r>
-            <w:r>
               <w:t xml:space="preserve">{% for field in contract.fields %}</w:t>
             </w:r>
           </w:p>
@@ -838,14 +756,6 @@
                 <w:sz w:val="20"/>
                 <w:szCs w:val="20"/>
               </w:rPr>
-              <w:t xml:space="preserve"/>
-            </w:r>
-            <w:r>
-              <w:rPr>
-                <w:b/>
-                <w:sz w:val="20"/>
-                <w:szCs w:val="20"/>
-              </w:rPr>
               <w:t xml:space="preserve">{{ field.label }}</w:t>
             </w:r>
           </w:p>
@@ -864,20 +774,10 @@
                 <w:sz w:val="20"/>
                 <w:szCs w:val="20"/>
               </w:rPr>
-              <w:t xml:space="preserve"/>
-            </w:r>
-            <w:r>
-              <w:rPr>
-                <w:sz w:val="20"/>
-                <w:szCs w:val="20"/>
-              </w:rPr>
               <w:t xml:space="preserve">{{ field.value }}</w:t>
             </w:r>
           </w:p>
           <w:p>
-            <w:r>
-              <w:t xml:space="preserve"/>
-            </w:r>
             <w:r>
               <w:t xml:space="preserve">{% endfor %}</w:t>
             </w:r>
@@ -887,17 +787,11 @@
     </w:tbl>
     <w:p>
       <w:r>
-        <w:t xml:space="preserve"/>
-      </w:r>
-      <w:r>
         <w:t xml:space="preserve">{% endif %}</w:t>
       </w:r>
     </w:p>
     <w:p>
       <w:r>
-        <w:t xml:space="preserve"/>
-      </w:r>
-      <w:r>
         <w:t xml:space="preserve">{% if contract.hasRisks %}</w:t>
       </w:r>
     </w:p>
@@ -910,9 +804,6 @@
       </w:r>
     </w:p>
     <w:p>
-      <w:r>
-        <w:t xml:space="preserve"/>
-      </w:r>
       <w:r>
         <w:t xml:space="preserve">{% for risk in contract.risks %}</w:t>
       </w:r>
@@ -925,37 +816,7 @@
         <w:rPr>
           <w:b/>
         </w:rPr>
-        <w:t xml:space="preserve"/>
-      </w:r>
-      <w:r>
-        <w:rPr>
-          <w:b/>
-        </w:rPr>
-        <w:t xml:space="preserve">{{ risk.issue }}</w:t>
-      </w:r>
-      <w:r>
-        <w:rPr>
-          <w:b/>
-        </w:rPr>
-        <w:t xml:space="preserve">  ·  </w:t>
-      </w:r>
-      <w:r>
-        <w:rPr>
-          <w:b/>
-        </w:rPr>
-        <w:t xml:space="preserve">{{ risk.severity }}</w:t>
-      </w:r>
-      <w:r>
-        <w:rPr>
-          <w:b/>
-        </w:rPr>
-        <w:t xml:space="preserve">  ·  </w:t>
-      </w:r>
-      <w:r>
-        <w:rPr>
-          <w:b/>
-        </w:rPr>
-        <w:t xml:space="preserve">{{ risk.verdict }}</w:t>
+        <w:t xml:space="preserve">{{ risk.issue }}  ·  {{ risk.severity }}  ·  {{ risk.verdict }}</w:t>
       </w:r>
     </w:p>
     <w:p>
@@ -963,17 +824,11 @@
         <w:pStyle w:val="BodyText"/>
       </w:pPr>
       <w:r>
-        <w:t xml:space="preserve"/>
-      </w:r>
-      <w:r>
         <w:t xml:space="preserve">{{ risk.rationale }}</w:t>
       </w:r>
     </w:p>
     <w:p>
       <w:r>
-        <w:t xml:space="preserve"/>
-      </w:r>
-      <w:r>
         <w:t xml:space="preserve">{% if hasCitation %}</w:t>
       </w:r>
     </w:p>
@@ -982,41 +837,26 @@
         <w:pStyle w:val="Caption"/>
       </w:pPr>
       <w:r>
-        <w:t xml:space="preserve">Citation: </w:t>
-      </w:r>
-      <w:r>
-        <w:t xml:space="preserve">{{ risk.citation }}</w:t>
-      </w:r>
-    </w:p>
-    <w:p>
-      <w:r>
-        <w:t xml:space="preserve"/>
-      </w:r>
+        <w:t xml:space="preserve">Citation: {{ risk.citation }}</w:t>
+      </w:r>
+    </w:p>
+    <w:p>
       <w:r>
         <w:t xml:space="preserve">{% endif %}</w:t>
       </w:r>
     </w:p>
     <w:p>
       <w:r>
-        <w:t xml:space="preserve"/>
-      </w:r>
-      <w:r>
         <w:t xml:space="preserve">{% endfor %}</w:t>
       </w:r>
     </w:p>
     <w:p>
       <w:r>
-        <w:t xml:space="preserve"/>
-      </w:r>
-      <w:r>
         <w:t xml:space="preserve">{% endif %}</w:t>
       </w:r>
     </w:p>
     <w:p>
       <w:r>
-        <w:t xml:space="preserve"/>
-      </w:r>
-      <w:r>
         <w:t xml:space="preserve">{% if aiNarrative %}</w:t>
       </w:r>
     </w:p>
@@ -1033,24 +873,15 @@
         <w:pStyle w:val="BodyText"/>
       </w:pPr>
       <w:r>
-        <w:t xml:space="preserve"/>
-      </w:r>
-      <w:r>
         <w:t xml:space="preserve">{{ contract.summary }}</w:t>
       </w:r>
     </w:p>
     <w:p>
       <w:r>
-        <w:t xml:space="preserve"/>
-      </w:r>
-      <w:r>
         <w:t xml:space="preserve">{% endif %}</w:t>
       </w:r>
     </w:p>
     <w:p>
-      <w:r>
-        <w:t xml:space="preserve"/>
-      </w:r>
       <w:r>
         <w:t xml:space="preserve">{% endfor %}</w:t>
       </w:r>
@@ -1155,9 +986,6 @@
           </w:tcPr>
           <w:p>
             <w:r>
-              <w:t xml:space="preserve"/>
-            </w:r>
-            <w:r>
               <w:t xml:space="preserve">{% for row in grid.rows %}</w:t>
             </w:r>
           </w:p>
@@ -1171,14 +999,6 @@
                 <w:sz w:val="20"/>
                 <w:szCs w:val="20"/>
               </w:rPr>
-              <w:t xml:space="preserve"/>
-            </w:r>
-            <w:r>
-              <w:rPr>
-                <w:b/>
-                <w:sz w:val="20"/>
-                <w:szCs w:val="20"/>
-              </w:rPr>
               <w:t xml:space="preserve">{{ row.name }}</w:t>
             </w:r>
           </w:p>
@@ -1197,20 +1017,10 @@
                 <w:sz w:val="20"/>
                 <w:szCs w:val="20"/>
               </w:rPr>
-              <w:t xml:space="preserve"/>
-            </w:r>
-            <w:r>
-              <w:rPr>
-                <w:sz w:val="20"/>
-                <w:szCs w:val="20"/>
-              </w:rPr>
               <w:t xml:space="preserve">{{ row.summary }}</w:t>
             </w:r>
           </w:p>
           <w:p>
-            <w:r>
-              <w:t xml:space="preserve"/>
-            </w:r>
             <w:r>
               <w:t xml:space="preserve">{% endfor %}</w:t>
             </w:r>

</xml_diff>